<commit_message>
Doc: sumar a Elian Zas al documento conjunto de enterprise-readiness
Seccion 22.4: el documento en preparacion pasa a figurar como conjunto entre
Vladimir Titov, Jesus Contreras, Ariel Melgratti y Elian Zas.

Co-Authored-By: Claude Opus 5 <noreply@anthropic.com>
</commit_message>
<xml_diff>
--- a/Documentation_Osocio_Form_Automation_EN_v2.docx
+++ b/Documentation_Osocio_Form_Automation_EN_v2.docx
@@ -22115,13 +22115,22 @@
         <w:t>Jesús Contreras</w:t>
       </w:r>
       <w:r>
-        <w:t xml:space="preserve"> and </w:t>
+        <w:t xml:space="preserve">, </w:t>
       </w:r>
       <w:r>
         <w:rPr>
           <w:b/>
         </w:rPr>
         <w:t>Ariel Melgratti</w:t>
+      </w:r>
+      <w:r>
+        <w:t xml:space="preserve"> and </w:t>
+      </w:r>
+      <w:r>
+        <w:rPr>
+          <w:b/>
+        </w:rPr>
+        <w:t>Elián Zás</w:t>
       </w:r>
       <w:r>
         <w:t xml:space="preserve">. Its purpose is to define how this application could be moved from its present form — a tool built and </w:t>

</xml_diff>